<commit_message>
Added an error report and a test file
</commit_message>
<xml_diff>
--- a/Documentation/TEst reports/2.7.0.0/Susanne og ole 21.docx
+++ b/Documentation/TEst reports/2.7.0.0/Susanne og ole 21.docx
@@ -380,6 +380,21 @@
           <w:color w:val="FF6600"/>
         </w:rPr>
         <w:t>JSJ: Det er helt forventeligt at finde tegn med værdi større end 0x3f, for de bliver jo mappet i notatapparatet til 6-punkt værdier. Men det er en fejl, hvis notatapparatet viser værdier, der ikke er 6-punkt.</w:t>
+      </w:r>
+    </w:p>
+    <w:p>
+      <w:pPr>
+        <w:pStyle w:val="Normal"/>
+        <w:spacing w:before="0" w:after="0"/>
+        <w:rPr>
+          <w:color w:val="FF6600"/>
+        </w:rPr>
+      </w:pPr>
+      <w:r>
+        <w:rPr>
+          <w:color w:val="FF6600"/>
+        </w:rPr>
+        <w:t>Hvis man åbner Ole's fil med et eksternt program får man et ganske nydeligt indhold vist i 6-punkts Braille. Checklige om der vises 6-punkt af notatapparatet.</w:t>
       </w:r>
     </w:p>
     <w:p>

</xml_diff>